<commit_message>
Tablero de los lunes: metas del mes 1 / 2 / 3 en una sola hoja (firmas acumuladas 2/4/6, activaciones 0/2/3); Word editado en el sitio, generador portado, PDF regenerado
Co-Authored-By: Claude Fable 5.1 <noreply@anthropic.com>
</commit_message>
<xml_diff>
--- a/recursos/comercial/INDUCCION_COMERCIAL/contratacion comercial/TABLERO_LUNES_ALIANZAS.docx
+++ b/recursos/comercial/INDUCCION_COMERCIAL/contratacion comercial/TABLERO_LUNES_ALIANZAS.docx
@@ -116,7 +116,7 @@
                 <w:color w:val="FFFFFF"/>
                 <w:sz w:val="17"/>
               </w:rPr>
-              <w:t>Meta mes 1</w:t>
+              <w:t>Meta del mes (1 / 2 / 3)</w:t>
             </w:r>
           </w:p>
         </w:tc>
@@ -463,7 +463,7 @@
               <w:rPr>
                 <w:sz w:val="17"/>
               </w:rPr>
-              <w:t>2 firmas</w:t>
+              <w:t>2 / 4 / 6 firmas acum. · 0 / 2 / 3 activaciones</w:t>
             </w:r>
           </w:p>
         </w:tc>
@@ -1094,7 +1094,7 @@
           <w:sz w:val="22"/>
           <w:lang w:val="es-CO"/>
         </w:rPr>
-        <w:t>4. En la misma reunión: embudo de la semana en tres líneas (lo anota el analista y se lo deja a gerencia)</w:t>
+        <w:t>4. En la misma reunión: embudo de la semana en tres líneas (lo anota el analista con datos que le llegan antes del lunes; el gerente de alianzas solo responde por la tercera)</w:t>
       </w:r>
     </w:p>
     <w:p>
@@ -1109,7 +1109,7 @@
         <w:rPr>
           <w:lang w:val="es-CO"/>
         </w:rPr>
-        <w:t>Pauta: gasto de la semana, leads, conversaciones (export de Meta o dato del trafficker).</w:t>
+        <w:t>Pauta: gasto de la semana, leads, conversaciones. Lo entrega el trafficker el viernes (export de Meta). No es del gerente de alianzas.</w:t>
       </w:r>
     </w:p>
     <w:p>
@@ -1124,7 +1124,7 @@
         <w:rPr>
           <w:lang w:val="es-CO"/>
         </w:rPr>
-        <w:t>Citas: agendadas, asistidas, separaciones, matrículas (panel de LaHaus y coordinación).</w:t>
+        <w:t>Citas: agendadas, asistidas, separaciones, matrículas. Lo entrega coordinación con el panel de la plataforma. No es del gerente de alianzas.</w:t>
       </w:r>
     </w:p>
     <w:p>
@@ -1139,7 +1139,7 @@
         <w:rPr>
           <w:lang w:val="es-CO"/>
         </w:rPr>
-        <w:t>Alianzas: los cinco indicadores de arriba en una línea.</w:t>
+        <w:t>Alianzas: los cinco indicadores de arriba en una línea. Esta sí la presenta el gerente de alianzas.</w:t>
       </w:r>
     </w:p>
     <w:p>

</xml_diff>